<commit_message>
docs(lettre full logistics): conduite complète de la manifestation, date du 29 juin
Ouverture et présentation réécrites : la lettre demande l'agrément
comme opérateur événementiel et annonce la prise en charge d'une
rencontre du cadrage au dossier de clôture, au lieu de se présenter
comme société de logistique et de transport.

Les quatre amorces deviennent Cadrage, Montage, Conduite de la séance
et Clôture — un cycle complet plutôt qu'un catalogue de moyens.

Le pied de page est supprimé : RCCM et NINEA figurent sous l'adresse en
en-tête. Date portée au 29 juin 2026.

Co-Authored-By: Claude Opus 5 <noreply@anthropic.com>
Claude-Session: https://claude.ai/code/session_01G6UQqMTpJ9TWrJ7oJutcLt
</commit_message>
<xml_diff>
--- a/docs/lettre-agrement-fonstab-full-logistics.docx
+++ b/docs/lettre-agrement-fonstab-full-logistics.docx
@@ -31,7 +31,7 @@
     </w:p>
     <w:p>
       <w:pPr>
-        <w:spacing w:after="440"/>
+        <w:spacing w:after="0"/>
         <w:jc w:val="center"/>
       </w:pPr>
       <w:r>
@@ -45,6 +45,20 @@
     </w:p>
     <w:p>
       <w:pPr>
+        <w:spacing w:after="440"/>
+        <w:jc w:val="center"/>
+      </w:pPr>
+      <w:r>
+        <w:rPr>
+          <w:b w:val="0"/>
+          <w:color w:val="555555"/>
+          <w:sz w:val="16"/>
+        </w:rPr>
+        <w:t>RCCM SN DKR 2024 B 11455  ·  NINEA 011088152</w:t>
+      </w:r>
+    </w:p>
+    <w:p>
+      <w:pPr>
         <w:spacing w:after="320"/>
         <w:jc w:val="right"/>
       </w:pPr>
@@ -52,7 +66,7 @@
         <w:rPr>
           <w:b w:val="0"/>
         </w:rPr>
-        <w:t>Dakar, le 24 septembre 2026</w:t>
+        <w:t>Dakar, le 29 juin 2026</w:t>
       </w:r>
     </w:p>
     <w:p>
@@ -107,7 +121,7 @@
         <w:rPr>
           <w:b/>
         </w:rPr>
-        <w:t>Objet : demande d'agrément — logistique des manifestations et transport de personnes</w:t>
+        <w:t>Objet : demande d'agrément en qualité d'opérateur événementiel</w:t>
       </w:r>
     </w:p>
     <w:p>
@@ -131,7 +145,19 @@
         <w:rPr>
           <w:b w:val="0"/>
         </w:rPr>
-        <w:t>Full Logistics est une société de logistique et de transport de personnes établie à Dakar. Nous mettons ces moyens au service des manifestations : réunions, ateliers, missions de terrain, cérémonies et voyages d'étude, à Dakar comme à l'intérieur du pays.</w:t>
+        <w:t>Nous avons l'honneur de solliciter votre agrément pour la conduite complète de vos manifestations.</w:t>
+      </w:r>
+    </w:p>
+    <w:p>
+      <w:pPr>
+        <w:spacing w:after="180"/>
+        <w:jc w:val="both"/>
+      </w:pPr>
+      <w:r>
+        <w:rPr>
+          <w:b w:val="0"/>
+        </w:rPr>
+        <w:t>Full Logistics prend une rencontre à sa charge du cadrage jusqu'au dossier de clôture. Nous en arrêtons le budget et le calendrier, retenons le site, mobilisons les moyens et les équipes, tenons la séance, puis rendons les lieux et le compte de la dépense. Le commanditaire garde la décision ; nous portons l'exécution.</w:t>
       </w:r>
     </w:p>
     <w:p>
@@ -143,10 +169,10 @@
         <w:rPr>
           <w:b/>
         </w:rPr>
-        <w:t xml:space="preserve">Déplacements. </w:t>
+        <w:t xml:space="preserve">Cadrage. </w:t>
       </w:r>
       <w:r>
-        <w:t>Véhicules avec chauffeur pour les délégations, navettes entre les hôtels et le lieu de la rencontre, rotations vers les sites visités. Le plan de transport est établi à partir de votre programme, et nous répondons des horaires.</w:t>
+        <w:t>Étude du besoin, repérage et réservation du site, budget par poste, rétroplanning, préparation et suivi des invitations.</w:t>
       </w:r>
     </w:p>
     <w:p>
@@ -158,10 +184,10 @@
         <w:rPr>
           <w:b/>
         </w:rPr>
-        <w:t xml:space="preserve">Manutention et installation. </w:t>
+        <w:t xml:space="preserve">Montage. </w:t>
       </w:r>
       <w:r>
-        <w:t>Chargement, acheminement et mise en place du matériel : sonorisation, mobilier, stands, supports d'exposition, dotations à distribuer. Reprise et stockage une fois la manifestation terminée.</w:t>
+        <w:t>Transport et pose des équipements, agencement des salles et des espaces d'exposition, régie du son et de l'image, balisage des accès.</w:t>
       </w:r>
     </w:p>
     <w:p>
@@ -173,10 +199,25 @@
         <w:rPr>
           <w:b/>
         </w:rPr>
-        <w:t xml:space="preserve">Accueil et séjour. </w:t>
+        <w:t xml:space="preserve">Conduite de la séance. </w:t>
       </w:r>
       <w:r>
-        <w:t>Prise en charge des participants venus des régions ou de l'étranger : accueil à l'aéroport, réservations d'hôtel, restauration, programme d'accompagnement.</w:t>
+        <w:t>Enregistrement des participants, tenue du programme, liaison avec le protocole, restauration, prise en charge des délégations et de leurs déplacements.</w:t>
+      </w:r>
+    </w:p>
+    <w:p>
+      <w:pPr>
+        <w:spacing w:after="180"/>
+        <w:jc w:val="both"/>
+      </w:pPr>
+      <w:r>
+        <w:rPr>
+          <w:b/>
+        </w:rPr>
+        <w:t xml:space="preserve">Clôture. </w:t>
+      </w:r>
+      <w:r>
+        <w:t>Démontage, restitution du site dans son état initial, dossier de fin de mission : liste de présence, photographies, dépenses justifiées.</w:t>
       </w:r>
     </w:p>
     <w:p>
@@ -188,7 +229,7 @@
         <w:rPr>
           <w:b w:val="0"/>
         </w:rPr>
-        <w:t>Chaque mission donne lieu à un ordre de mission chiffré, à la désignation d'un coordonnateur et à un rapport de fin de prestation accompagné des justificatifs.</w:t>
+        <w:t>Nos véhicules, nos équipes de manutention et notre réseau de prestataires nous permettent de tenir une manifestation à Dakar comme en région, y compris lorsqu'elle se déplace d'un site à l'autre. Un coordonnateur est désigné à la commande et reste votre interlocuteur jusqu'à la remise du dossier.</w:t>
       </w:r>
     </w:p>
     <w:p>
@@ -200,7 +241,7 @@
         <w:rPr>
           <w:b w:val="0"/>
         </w:rPr>
-        <w:t>Full Logistics SARL est immatriculée au registre du commerce sous le numéro SN DKR 2024 B 11455 et dispose du NINEA 011088152. Nos activités déclarées couvrent la manutention et le shipping, le transport routier, le transport de personnes et le tourisme.</w:t>
+        <w:t>Nos activités déclarées couvrent la manutention et le shipping, le transport routier, le transport de personnes et le tourisme, ainsi que le commerce général : les prestations ci-dessus s'y rattachent.</w:t>
       </w:r>
     </w:p>
     <w:p>
@@ -212,7 +253,7 @@
         <w:rPr>
           <w:b w:val="0"/>
         </w:rPr>
-        <w:t>Nous sollicitons votre agrément à ce titre. Nos documents d'immatriculation sont joints à la présente.</w:t>
+        <w:t>Les documents d'immatriculation de la société sont joints à la présente.</w:t>
       </w:r>
     </w:p>
     <w:p>
@@ -229,7 +270,7 @@
     </w:p>
     <w:p>
       <w:pPr>
-        <w:spacing w:after="440"/>
+        <w:spacing w:after="480"/>
       </w:pPr>
     </w:p>
     <w:p>
@@ -245,7 +286,7 @@
     </w:p>
     <w:p>
       <w:pPr>
-        <w:spacing w:after="400"/>
+        <w:spacing w:after="0"/>
       </w:pPr>
       <w:r>
         <w:rPr>
@@ -256,23 +297,9 @@
         <w:t>Gérant</w:t>
       </w:r>
     </w:p>
-    <w:p>
-      <w:pPr>
-        <w:spacing w:after="0"/>
-        <w:jc w:val="center"/>
-      </w:pPr>
-      <w:r>
-        <w:rPr>
-          <w:b w:val="0"/>
-          <w:color w:val="666666"/>
-          <w:sz w:val="15"/>
-        </w:rPr>
-        <w:t>FULL LOGISTICS SARL — RCCM SN DKR 2024 B 11455 — NINEA 011088152 — HLM Mariste, Dakar — Tél. : +221 77 645 65 17</w:t>
-      </w:r>
-    </w:p>
     <w:sectPr>
       <w:pgSz w:w="12240" w:h="15840"/>
-      <w:pgMar w:top="964" w:right="1304" w:bottom="737" w:left="1304" w:header="720" w:footer="720" w:gutter="0"/>
+      <w:pgMar w:top="964" w:right="1304" w:bottom="850" w:left="1304" w:header="720" w:footer="720" w:gutter="0"/>
       <w:cols w:space="720"/>
       <w:docGrid w:linePitch="360"/>
     </w:sectPr>

</xml_diff>